<commit_message>
Standardize and sanitize all endpoint paths to correct cloud domain
</commit_message>
<xml_diff>
--- a/project keys.docx
+++ b/project keys.docx
@@ -112,6 +112,60 @@
           <w:rtl/>
         </w:rPr>
       </w:pPr>
+      <w:proofErr w:type="spellStart"/>
+      <w:r>
+        <w:rPr>
+          <w:b/>
+          <w:bCs/>
+          <w:sz w:val="36"/>
+          <w:szCs w:val="36"/>
+        </w:rPr>
+        <w:t>railway_url</w:t>
+      </w:r>
+      <w:proofErr w:type="spellEnd"/>
+      <w:r>
+        <w:rPr>
+          <w:b/>
+          <w:bCs/>
+          <w:sz w:val="36"/>
+          <w:szCs w:val="36"/>
+        </w:rPr>
+        <w:t>=</w:t>
+      </w:r>
+      <w:proofErr w:type="spellStart"/>
+      <w:r>
+        <w:rPr>
+          <w:rFonts w:ascii="Segoe UI" w:hAnsi="Segoe UI" w:cs="Segoe UI"/>
+          <w:color w:val="FFFFFF"/>
+          <w:sz w:val="27"/>
+          <w:szCs w:val="27"/>
+          <w:shd w:val="clear" w:color="auto" w:fill="13111C"/>
+        </w:rPr>
+        <w:t>linkedin</w:t>
+      </w:r>
+      <w:proofErr w:type="spellEnd"/>
+      <w:r>
+        <w:rPr>
+          <w:rFonts w:ascii="Segoe UI" w:hAnsi="Segoe UI" w:cs="Segoe UI"/>
+          <w:color w:val="FFFFFF"/>
+          <w:sz w:val="27"/>
+          <w:szCs w:val="27"/>
+          <w:shd w:val="clear" w:color="auto" w:fill="13111C"/>
+        </w:rPr>
+        <w:t>-ai-sass-</w:t>
+      </w:r>
+      <w:proofErr w:type="spellStart"/>
+      <w:r>
+        <w:rPr>
+          <w:rFonts w:ascii="Segoe UI" w:hAnsi="Segoe UI" w:cs="Segoe UI"/>
+          <w:color w:val="FFFFFF"/>
+          <w:sz w:val="27"/>
+          <w:szCs w:val="27"/>
+          <w:shd w:val="clear" w:color="auto" w:fill="13111C"/>
+        </w:rPr>
+        <w:t>production.up.railway.app</w:t>
+      </w:r>
+      <w:proofErr w:type="spellEnd"/>
     </w:p>
     <w:p>
       <w:pPr>

</xml_diff>